<commit_message>
Add real per-department HOD/faculty data from official site; chat bubbles now side by side
Extracted current HOD names and faculty headcounts for ECE, EEE, IT, and
CSE AI&ML from bvrithyderabad.edu.in (faculty + about-hod pages for each
department) so the chatbot can answer these instead of redirecting every
non-CSE department query. Regenerated the KB doc, rebuilt the vectorstore,
and refreshed the eval report against the updated knowledge base.

Also styled chat messages so user messages float right and assistant
messages float left, like a normal chat UI, instead of one full-width column.

Co-Authored-By: Claude Sonnet 5 <noreply@anthropic.com>
</commit_message>
<xml_diff>
--- a/data/bvrith_college_info.docx
+++ b/data/bvrith_college_info.docx
@@ -557,7 +557,91 @@
     </w:p>
     <w:p>
       <w:r>
-        <w:t>Named HODs and detailed faculty qualifications for ECE, EEE, IT, and CSE AI&amp;ML departments are not included in this document. If asked for a specific faculty member's profile outside CSE or the Principal, the chatbot should direct the user to the relevant department page on the official website or the admissions office rather than guessing.</w:t>
+        <w:t>Department of Electronics and Communication Engineering:</w:t>
+      </w:r>
+    </w:p>
+    <w:p>
+      <w:pPr>
+        <w:pStyle w:val="ListBullet"/>
+      </w:pPr>
+      <w:r>
+        <w:t>- Head of Department: Dr. Nagesh Deevi, Associate Professor &amp; HoD, Dept. of ECE. Ph.D in RF-VLSI (NIT Warangal); IEEE member; research interests include device modeling, RF communications, on-chip component design, and semiconductor packaging.</w:t>
+      </w:r>
+    </w:p>
+    <w:p>
+      <w:pPr>
+        <w:pStyle w:val="ListBullet"/>
+      </w:pPr>
+      <w:r>
+        <w:t>- Faculty strength: 27 total — 5 Professors, 7 Associate Professors, 15 Assistant Professors.</w:t>
+      </w:r>
+    </w:p>
+    <w:p>
+      <w:r>
+        <w:t>Department of Electrical and Electronics Engineering:</w:t>
+      </w:r>
+    </w:p>
+    <w:p>
+      <w:pPr>
+        <w:pStyle w:val="ListBullet"/>
+      </w:pPr>
+      <w:r>
+        <w:t>- Head of Department: Dr. M. Sharanya, Professor &amp; HoD, Dept. of EEE. B.Tech in EEE (JNTUH, 2001); M.Tech in Power Electronics and Electrical Drives (JNTUH, 2007); Ph.D (JNTUH, 2020); research interests include Power Electronics, Power Quality, Renewable Energy, and Electric Vehicles.</w:t>
+      </w:r>
+    </w:p>
+    <w:p>
+      <w:pPr>
+        <w:pStyle w:val="ListBullet"/>
+      </w:pPr>
+      <w:r>
+        <w:t>- Faculty strength: 16 total — 2 Professors, 5 Associate Professors, 9 Assistant Professors.</w:t>
+      </w:r>
+    </w:p>
+    <w:p>
+      <w:r>
+        <w:t>Department of Information Technology:</w:t>
+      </w:r>
+    </w:p>
+    <w:p>
+      <w:pPr>
+        <w:pStyle w:val="ListBullet"/>
+      </w:pPr>
+      <w:r>
+        <w:t>- Head of Department: Dr. K. Srikar Goud, Assistant Professor &amp; I/C HoD (In-Charge), Dept. of IT.</w:t>
+      </w:r>
+    </w:p>
+    <w:p>
+      <w:pPr>
+        <w:pStyle w:val="ListBullet"/>
+      </w:pPr>
+      <w:r>
+        <w:t>- Faculty strength: 9 total — 1 Associate Professor (Dr. K. Bharathi) and 8 Assistant Professors (including Mr. A. Rajashekar Reddy, Ms. K. Kavitha, Ms. A. Aruna Jyothi, Ms. N. Sandhya, Ms. Danthuluri Mani Sri Madhuri, Ms. A. S. S. M. Pravallika, and Ms. T. Sukanya).</w:t>
+      </w:r>
+    </w:p>
+    <w:p>
+      <w:r>
+        <w:t>Department of CSE — Artificial Intelligence and Machine Learning (CSE AI&amp;ML / CSM):</w:t>
+      </w:r>
+    </w:p>
+    <w:p>
+      <w:pPr>
+        <w:pStyle w:val="ListBullet"/>
+      </w:pPr>
+      <w:r>
+        <w:t>- Head of Department: Dr. Venkata Raja Sekhar Reddy N, Professor &amp; HoD, Dept. of CSE (AI&amp;ML). Contact: hod.aiml@bvrithyderabad.edu.in.</w:t>
+      </w:r>
+    </w:p>
+    <w:p>
+      <w:pPr>
+        <w:pStyle w:val="ListBullet"/>
+      </w:pPr>
+      <w:r>
+        <w:t>- Faculty strength: 15 total — 2 Professors, 0 Associate Professors, 13 Assistant Professors.</w:t>
+      </w:r>
+    </w:p>
+    <w:p>
+      <w:r>
+        <w:t>Faculty rosters and qualifications beyond what is listed above (e.g. individual assistant professor profiles) are published on each department's official faculty page at bvrithyderabad.edu.in; the chatbot should direct the user there or to the admissions office rather than guessing if asked for detail not covered in this document.</w:t>
       </w:r>
     </w:p>
     <w:p>

</xml_diff>